<commit_message>
Added Databinding from Import files
</commit_message>
<xml_diff>
--- a/src/Layers/W1/BaseApp/Foundation/Reporting/ReportParts/HeaderFooterDesign/ExternalMinimalistic.docx
+++ b/src/Layers/W1/BaseApp/Foundation/Reporting/ReportParts/HeaderFooterDesign/ExternalMinimalistic.docx
@@ -603,6 +603,7 @@
             </w:placeholder>
             <w15:color w:val="808080"/>
             <w:text/>
+            <w:dataBinding w:prefixMappings="xmlns:ns0='urn:microsoft-dynamics-nav/reports/Tenant_Report_Defaults/2000000001/' " w:xpath="/ns0:NavWordReportXmlPart[1]/ns0:BCReportInformation[1]/ns0:ReportRequest[1]/ns0:CompanyName[1]"/>
           </w:sdtPr>
           <w:sdtContent>
             <w:p>
@@ -728,6 +729,7 @@
             </w:placeholder>
             <w15:color w:val="808080"/>
             <w:text/>
+            <w:dataBinding w:prefixMappings="xmlns:ns0='urn:microsoft-dynamics-nav/reports/Tenant_Report_Defaults/2000000001/' " w:xpath="/ns0:NavWordReportXmlPart[1]/ns0:BCReportInformation[1]/ns0:ReportRequest[1]/ns0:CompanyName[1]"/>
           </w:sdtPr>
           <w:sdtContent>
             <w:p>
@@ -789,6 +791,7 @@
             </w:placeholder>
             <w15:color w:val="808080"/>
             <w:text/>
+            <w:dataBinding w:prefixMappings="xmlns:ns0='urn:microsoft-dynamics-nav/reports/Tenant_Report_Defaults/2000000001/' " w:xpath="/ns0:NavWordReportXmlPart[1]/ns0:BCReportInformation[1]/ns0:CompanyMetadata[1]/ns0:CompanyHomePage[1]"/>
           </w:sdtPr>
           <w:sdtContent>
             <w:p>
@@ -838,6 +841,7 @@
             </w:placeholder>
             <w15:color w:val="808080"/>
             <w:text/>
+            <w:dataBinding w:prefixMappings="xmlns:ns0='urn:microsoft-dynamics-nav/reports/Tenant_Report_Defaults/2000000001/' " w:xpath="/ns0:NavWordReportXmlPart[1]/ns0:BCReportInformation[1]/ns0:CompanyMetadata[1]/ns0:CompanyPhone[1]"/>
           </w:sdtPr>
           <w:sdtContent>
             <w:p>
@@ -887,6 +891,7 @@
             </w:placeholder>
             <w15:color w:val="808080"/>
             <w:text/>
+            <w:dataBinding w:prefixMappings="xmlns:ns0='urn:microsoft-dynamics-nav/reports/Tenant_Report_Defaults/2000000001/' " w:xpath="/ns0:NavWordReportXmlPart[1]/ns0:BCReportInformation[1]/ns0:CompanyMetadata[1]/ns0:CompanyEmail[1]"/>
           </w:sdtPr>
           <w:sdtContent>
             <w:p>
@@ -936,6 +941,7 @@
             </w:placeholder>
             <w15:color w:val="808080"/>
             <w:text/>
+            <w:dataBinding w:prefixMappings="xmlns:ns0='urn:microsoft-dynamics-nav/reports/Tenant_Report_Defaults/2000000001/' " w:xpath="/ns0:NavWordReportXmlPart[1]/ns0:BCReportInformation[1]/ns0:CompanyMetadata[1]/ns0:CompanyFaxNo[1]"/>
           </w:sdtPr>
           <w:sdtContent>
             <w:p>
@@ -1015,7 +1021,7 @@
             </w:tabs>
             <w:ind w:right="26"/>
             <w:rPr>
-              <w:rFonts w:ascii="Aptos Narrow" w:eastAsiaTheme="majorEastAsia" w:hAnsi="Aptos Narrow"/>
+              <w:rFonts w:ascii="Aptos Narrow" w:hAnsi="Aptos Narrow" w:eastAsiaTheme="majorEastAsia"/>
               <w:color w:val="242424"/>
               <w:sz w:val="36"/>
               <w:szCs w:val="36"/>
@@ -1032,7 +1038,7 @@
             </w:tabs>
             <w:ind w:right="26"/>
             <w:rPr>
-              <w:rFonts w:ascii="Aptos Narrow" w:eastAsiaTheme="majorEastAsia" w:hAnsi="Aptos Narrow"/>
+              <w:rFonts w:ascii="Aptos Narrow" w:hAnsi="Aptos Narrow" w:eastAsiaTheme="majorEastAsia"/>
               <w:color w:val="242424"/>
               <w:sz w:val="36"/>
               <w:szCs w:val="36"/>
@@ -1063,6 +1069,7 @@
               </w:placeholder>
               <w15:color w:val="808080"/>
               <w:text/>
+              <w:dataBinding w:prefixMappings="xmlns:ns0='urn:microsoft-dynamics-nav/reports/Tenant_Report_Defaults/2000000001/' " w:xpath="/ns0:NavWordReportXmlPart[1]/ns0:BCReportInformation[1]/ns0:ReportMetadata[1]/ns0:ReportCaption[1]"/>
             </w:sdtPr>
             <w:sdtContent>
               <w:r>
@@ -1093,7 +1100,7 @@
 </file>
 
 <file path=word/header2.xml><?xml version="1.0" encoding="utf-8"?>
-<w:hdr xmlns:wpc="http://schemas.microsoft.com/office/word/2010/wordprocessingCanvas" xmlns:cx="http://schemas.microsoft.com/office/drawing/2014/chartex" xmlns:cx1="http://schemas.microsoft.com/office/drawing/2015/9/8/chartex" xmlns:cx2="http://schemas.microsoft.com/office/drawing/2015/10/21/chartex" xmlns:cx3="http://schemas.microsoft.com/office/drawing/2016/5/9/chartex" xmlns:cx4="http://schemas.microsoft.com/office/drawing/2016/5/10/chartex" xmlns:cx5="http://schemas.microsoft.com/office/drawing/2016/5/11/chartex" xmlns:cx6="http://schemas.microsoft.com/office/drawing/2016/5/12/chartex" xmlns:cx7="http://schemas.microsoft.com/office/drawing/2016/5/13/chartex" xmlns:cx8="http://schemas.microsoft.com/office/drawing/2016/5/14/chartex" xmlns:mc="http://schemas.openxmlformats.org/markup-compatibility/2006" xmlns:aink="http://schemas.microsoft.com/office/drawing/2016/ink" xmlns:am3d="http://schemas.microsoft.com/office/drawing/2017/model3d" xmlns:o="urn:schemas-microsoft-com:office:office" xmlns:oel="http://schemas.microsoft.com/office/2019/extlst" xmlns:r="http://schemas.openxmlformats.org/officeDocument/2006/relationships" xmlns:m="http://schemas.openxmlformats.org/officeDocument/2006/math" xmlns:v="urn:schemas-microsoft-com:vml" xmlns:wp14="http://schemas.microsoft.com/office/word/2010/wordprocessingDrawing" xmlns:wp="http://schemas.openxmlformats.org/drawingml/2006/wordprocessingDrawing" xmlns:w10="urn:schemas-microsoft-com:office:word" xmlns:w="http://schemas.openxmlformats.org/wordprocessingml/2006/main" xmlns:w14="http://schemas.microsoft.com/office/word/2010/wordml" xmlns:w15="http://schemas.microsoft.com/office/word/2012/wordml" xmlns:w16cex="http://schemas.microsoft.com/office/word/2018/wordml/cex" xmlns:w16cid="http://schemas.microsoft.com/office/word/2016/wordml/cid" xmlns:w16="http://schemas.microsoft.com/office/word/2018/wordml" xmlns:w16du="http://schemas.microsoft.com/office/word/2023/wordml/word16du" xmlns:w16sdtdh="http://schemas.microsoft.com/office/word/2020/wordml/sdtdatahash" xmlns:w16sdtfl="http://schemas.microsoft.com/office/word/2024/wordml/sdtformatlock" xmlns:w16se="http://schemas.microsoft.com/office/word/2015/wordml/symex" xmlns:wpg="http://schemas.microsoft.com/office/word/2010/wordprocessingGroup" xmlns:wpi="http://schemas.microsoft.com/office/word/2010/wordprocessingInk" xmlns:wne="http://schemas.microsoft.com/office/word/2006/wordml" xmlns:wps="http://schemas.microsoft.com/office/word/2010/wordprocessingShape" mc:Ignorable="w14 w15 w16se w16cid w16 w16cex w16sdtdh w16sdtfl w16du wp14">
+<w:hdr xmlns:a="http://schemas.openxmlformats.org/drawingml/2006/main" xmlns:pic="http://schemas.openxmlformats.org/drawingml/2006/picture" xmlns:a14="http://schemas.microsoft.com/office/drawing/2010/main" xmlns:wpc="http://schemas.microsoft.com/office/word/2010/wordprocessingCanvas" xmlns:cx="http://schemas.microsoft.com/office/drawing/2014/chartex" xmlns:cx1="http://schemas.microsoft.com/office/drawing/2015/9/8/chartex" xmlns:cx2="http://schemas.microsoft.com/office/drawing/2015/10/21/chartex" xmlns:cx3="http://schemas.microsoft.com/office/drawing/2016/5/9/chartex" xmlns:cx4="http://schemas.microsoft.com/office/drawing/2016/5/10/chartex" xmlns:cx5="http://schemas.microsoft.com/office/drawing/2016/5/11/chartex" xmlns:cx6="http://schemas.microsoft.com/office/drawing/2016/5/12/chartex" xmlns:cx7="http://schemas.microsoft.com/office/drawing/2016/5/13/chartex" xmlns:cx8="http://schemas.microsoft.com/office/drawing/2016/5/14/chartex" xmlns:mc="http://schemas.openxmlformats.org/markup-compatibility/2006" xmlns:aink="http://schemas.microsoft.com/office/drawing/2016/ink" xmlns:am3d="http://schemas.microsoft.com/office/drawing/2017/model3d" xmlns:o="urn:schemas-microsoft-com:office:office" xmlns:oel="http://schemas.microsoft.com/office/2019/extlst" xmlns:r="http://schemas.openxmlformats.org/officeDocument/2006/relationships" xmlns:m="http://schemas.openxmlformats.org/officeDocument/2006/math" xmlns:v="urn:schemas-microsoft-com:vml" xmlns:wp14="http://schemas.microsoft.com/office/word/2010/wordprocessingDrawing" xmlns:wp="http://schemas.openxmlformats.org/drawingml/2006/wordprocessingDrawing" xmlns:w10="urn:schemas-microsoft-com:office:word" xmlns:w="http://schemas.openxmlformats.org/wordprocessingml/2006/main" xmlns:w14="http://schemas.microsoft.com/office/word/2010/wordml" xmlns:w15="http://schemas.microsoft.com/office/word/2012/wordml" xmlns:w16cex="http://schemas.microsoft.com/office/word/2018/wordml/cex" xmlns:w16cid="http://schemas.microsoft.com/office/word/2016/wordml/cid" xmlns:w16="http://schemas.microsoft.com/office/word/2018/wordml" xmlns:w16du="http://schemas.microsoft.com/office/word/2023/wordml/word16du" xmlns:w16sdtdh="http://schemas.microsoft.com/office/word/2020/wordml/sdtdatahash" xmlns:w16sdtfl="http://schemas.microsoft.com/office/word/2024/wordml/sdtformatlock" xmlns:w16se="http://schemas.microsoft.com/office/word/2015/wordml/symex" xmlns:wpg="http://schemas.microsoft.com/office/word/2010/wordprocessingGroup" xmlns:wpi="http://schemas.microsoft.com/office/word/2010/wordprocessingInk" xmlns:wne="http://schemas.microsoft.com/office/word/2006/wordml" xmlns:wps="http://schemas.microsoft.com/office/word/2010/wordprocessingShape" mc:Ignorable="w14 w15 w16se w16cid w16 w16cex w16sdtdh w16sdtfl w16du wp14">
   <w:tbl>
     <w:tblPr>
       <w:tblStyle w:val="BCBlockTable"/>
@@ -1116,6 +1123,7 @@
           <w:id w:val="-1878226836"/>
           <w:showingPlcHdr/>
           <w:picture/>
+          <w:dataBinding w:prefixMappings="xmlns:ns0='urn:microsoft-dynamics-nav/reports/Tenant_Report_Defaults/2000000001/' " w:xpath="/ns0:NavWordReportXmlPart[1]/ns0:BCReportInformation[1]/ns0:CompanyMetadata[1]/ns0:CompanyLogo[1]"/>
         </w:sdtPr>
         <w:sdtContent>
           <w:tc>
@@ -1212,6 +1220,7 @@
               </w:placeholder>
               <w15:color w:val="808080"/>
               <w:text/>
+              <w:dataBinding w:prefixMappings="xmlns:ns0='urn:microsoft-dynamics-nav/reports/Tenant_Report_Defaults/2000000001/' " w:xpath="/ns0:NavWordReportXmlPart[1]/ns0:BCReportInformation[1]/ns0:ReportMetadata[1]/ns0:ReportCaption[1]"/>
             </w:sdtPr>
             <w:sdtContent>
               <w:r>

</xml_diff>

<commit_message>
Merge ce887041e88511837acaef84ad120e07cf0ff7f0 into 3bfd6e5511deec04fee3b22f6e3a0c282006ba08
</commit_message>
<xml_diff>
--- a/src/Layers/W1/BaseApp/Foundation/Reporting/ReportParts/HeaderFooterDesign/ExternalMinimalistic.docx
+++ b/src/Layers/W1/BaseApp/Foundation/Reporting/ReportParts/HeaderFooterDesign/ExternalMinimalistic.docx
@@ -603,6 +603,7 @@
             </w:placeholder>
             <w15:color w:val="808080"/>
             <w:text/>
+            <w:dataBinding w:prefixMappings="xmlns:ns0='urn:microsoft-dynamics-nav/reports/Tenant_Report_Defaults/2000000001/' " w:xpath="/ns0:NavWordReportXmlPart[1]/ns0:BCReportInformation[1]/ns0:ReportRequest[1]/ns0:CompanyName[1]"/>
           </w:sdtPr>
           <w:sdtContent>
             <w:p>
@@ -728,6 +729,7 @@
             </w:placeholder>
             <w15:color w:val="808080"/>
             <w:text/>
+            <w:dataBinding w:prefixMappings="xmlns:ns0='urn:microsoft-dynamics-nav/reports/Tenant_Report_Defaults/2000000001/' " w:xpath="/ns0:NavWordReportXmlPart[1]/ns0:BCReportInformation[1]/ns0:ReportRequest[1]/ns0:CompanyName[1]"/>
           </w:sdtPr>
           <w:sdtContent>
             <w:p>
@@ -789,6 +791,7 @@
             </w:placeholder>
             <w15:color w:val="808080"/>
             <w:text/>
+            <w:dataBinding w:prefixMappings="xmlns:ns0='urn:microsoft-dynamics-nav/reports/Tenant_Report_Defaults/2000000001/' " w:xpath="/ns0:NavWordReportXmlPart[1]/ns0:BCReportInformation[1]/ns0:CompanyMetadata[1]/ns0:CompanyHomePage[1]"/>
           </w:sdtPr>
           <w:sdtContent>
             <w:p>
@@ -838,6 +841,7 @@
             </w:placeholder>
             <w15:color w:val="808080"/>
             <w:text/>
+            <w:dataBinding w:prefixMappings="xmlns:ns0='urn:microsoft-dynamics-nav/reports/Tenant_Report_Defaults/2000000001/' " w:xpath="/ns0:NavWordReportXmlPart[1]/ns0:BCReportInformation[1]/ns0:CompanyMetadata[1]/ns0:CompanyPhone[1]"/>
           </w:sdtPr>
           <w:sdtContent>
             <w:p>
@@ -887,6 +891,7 @@
             </w:placeholder>
             <w15:color w:val="808080"/>
             <w:text/>
+            <w:dataBinding w:prefixMappings="xmlns:ns0='urn:microsoft-dynamics-nav/reports/Tenant_Report_Defaults/2000000001/' " w:xpath="/ns0:NavWordReportXmlPart[1]/ns0:BCReportInformation[1]/ns0:CompanyMetadata[1]/ns0:CompanyEmail[1]"/>
           </w:sdtPr>
           <w:sdtContent>
             <w:p>
@@ -936,6 +941,7 @@
             </w:placeholder>
             <w15:color w:val="808080"/>
             <w:text/>
+            <w:dataBinding w:prefixMappings="xmlns:ns0='urn:microsoft-dynamics-nav/reports/Tenant_Report_Defaults/2000000001/' " w:xpath="/ns0:NavWordReportXmlPart[1]/ns0:BCReportInformation[1]/ns0:CompanyMetadata[1]/ns0:CompanyFaxNo[1]"/>
           </w:sdtPr>
           <w:sdtContent>
             <w:p>
@@ -1015,7 +1021,7 @@
             </w:tabs>
             <w:ind w:right="26"/>
             <w:rPr>
-              <w:rFonts w:ascii="Aptos Narrow" w:eastAsiaTheme="majorEastAsia" w:hAnsi="Aptos Narrow"/>
+              <w:rFonts w:ascii="Aptos Narrow" w:hAnsi="Aptos Narrow" w:eastAsiaTheme="majorEastAsia"/>
               <w:color w:val="242424"/>
               <w:sz w:val="36"/>
               <w:szCs w:val="36"/>
@@ -1032,7 +1038,7 @@
             </w:tabs>
             <w:ind w:right="26"/>
             <w:rPr>
-              <w:rFonts w:ascii="Aptos Narrow" w:eastAsiaTheme="majorEastAsia" w:hAnsi="Aptos Narrow"/>
+              <w:rFonts w:ascii="Aptos Narrow" w:hAnsi="Aptos Narrow" w:eastAsiaTheme="majorEastAsia"/>
               <w:color w:val="242424"/>
               <w:sz w:val="36"/>
               <w:szCs w:val="36"/>
@@ -1063,6 +1069,7 @@
               </w:placeholder>
               <w15:color w:val="808080"/>
               <w:text/>
+              <w:dataBinding w:prefixMappings="xmlns:ns0='urn:microsoft-dynamics-nav/reports/Tenant_Report_Defaults/2000000001/' " w:xpath="/ns0:NavWordReportXmlPart[1]/ns0:BCReportInformation[1]/ns0:ReportMetadata[1]/ns0:ReportCaption[1]"/>
             </w:sdtPr>
             <w:sdtContent>
               <w:r>
@@ -1093,7 +1100,7 @@
 </file>
 
 <file path=word/header2.xml><?xml version="1.0" encoding="utf-8"?>
-<w:hdr xmlns:wpc="http://schemas.microsoft.com/office/word/2010/wordprocessingCanvas" xmlns:cx="http://schemas.microsoft.com/office/drawing/2014/chartex" xmlns:cx1="http://schemas.microsoft.com/office/drawing/2015/9/8/chartex" xmlns:cx2="http://schemas.microsoft.com/office/drawing/2015/10/21/chartex" xmlns:cx3="http://schemas.microsoft.com/office/drawing/2016/5/9/chartex" xmlns:cx4="http://schemas.microsoft.com/office/drawing/2016/5/10/chartex" xmlns:cx5="http://schemas.microsoft.com/office/drawing/2016/5/11/chartex" xmlns:cx6="http://schemas.microsoft.com/office/drawing/2016/5/12/chartex" xmlns:cx7="http://schemas.microsoft.com/office/drawing/2016/5/13/chartex" xmlns:cx8="http://schemas.microsoft.com/office/drawing/2016/5/14/chartex" xmlns:mc="http://schemas.openxmlformats.org/markup-compatibility/2006" xmlns:aink="http://schemas.microsoft.com/office/drawing/2016/ink" xmlns:am3d="http://schemas.microsoft.com/office/drawing/2017/model3d" xmlns:o="urn:schemas-microsoft-com:office:office" xmlns:oel="http://schemas.microsoft.com/office/2019/extlst" xmlns:r="http://schemas.openxmlformats.org/officeDocument/2006/relationships" xmlns:m="http://schemas.openxmlformats.org/officeDocument/2006/math" xmlns:v="urn:schemas-microsoft-com:vml" xmlns:wp14="http://schemas.microsoft.com/office/word/2010/wordprocessingDrawing" xmlns:wp="http://schemas.openxmlformats.org/drawingml/2006/wordprocessingDrawing" xmlns:w10="urn:schemas-microsoft-com:office:word" xmlns:w="http://schemas.openxmlformats.org/wordprocessingml/2006/main" xmlns:w14="http://schemas.microsoft.com/office/word/2010/wordml" xmlns:w15="http://schemas.microsoft.com/office/word/2012/wordml" xmlns:w16cex="http://schemas.microsoft.com/office/word/2018/wordml/cex" xmlns:w16cid="http://schemas.microsoft.com/office/word/2016/wordml/cid" xmlns:w16="http://schemas.microsoft.com/office/word/2018/wordml" xmlns:w16du="http://schemas.microsoft.com/office/word/2023/wordml/word16du" xmlns:w16sdtdh="http://schemas.microsoft.com/office/word/2020/wordml/sdtdatahash" xmlns:w16sdtfl="http://schemas.microsoft.com/office/word/2024/wordml/sdtformatlock" xmlns:w16se="http://schemas.microsoft.com/office/word/2015/wordml/symex" xmlns:wpg="http://schemas.microsoft.com/office/word/2010/wordprocessingGroup" xmlns:wpi="http://schemas.microsoft.com/office/word/2010/wordprocessingInk" xmlns:wne="http://schemas.microsoft.com/office/word/2006/wordml" xmlns:wps="http://schemas.microsoft.com/office/word/2010/wordprocessingShape" mc:Ignorable="w14 w15 w16se w16cid w16 w16cex w16sdtdh w16sdtfl w16du wp14">
+<w:hdr xmlns:a="http://schemas.openxmlformats.org/drawingml/2006/main" xmlns:pic="http://schemas.openxmlformats.org/drawingml/2006/picture" xmlns:a14="http://schemas.microsoft.com/office/drawing/2010/main" xmlns:wpc="http://schemas.microsoft.com/office/word/2010/wordprocessingCanvas" xmlns:cx="http://schemas.microsoft.com/office/drawing/2014/chartex" xmlns:cx1="http://schemas.microsoft.com/office/drawing/2015/9/8/chartex" xmlns:cx2="http://schemas.microsoft.com/office/drawing/2015/10/21/chartex" xmlns:cx3="http://schemas.microsoft.com/office/drawing/2016/5/9/chartex" xmlns:cx4="http://schemas.microsoft.com/office/drawing/2016/5/10/chartex" xmlns:cx5="http://schemas.microsoft.com/office/drawing/2016/5/11/chartex" xmlns:cx6="http://schemas.microsoft.com/office/drawing/2016/5/12/chartex" xmlns:cx7="http://schemas.microsoft.com/office/drawing/2016/5/13/chartex" xmlns:cx8="http://schemas.microsoft.com/office/drawing/2016/5/14/chartex" xmlns:mc="http://schemas.openxmlformats.org/markup-compatibility/2006" xmlns:aink="http://schemas.microsoft.com/office/drawing/2016/ink" xmlns:am3d="http://schemas.microsoft.com/office/drawing/2017/model3d" xmlns:o="urn:schemas-microsoft-com:office:office" xmlns:oel="http://schemas.microsoft.com/office/2019/extlst" xmlns:r="http://schemas.openxmlformats.org/officeDocument/2006/relationships" xmlns:m="http://schemas.openxmlformats.org/officeDocument/2006/math" xmlns:v="urn:schemas-microsoft-com:vml" xmlns:wp14="http://schemas.microsoft.com/office/word/2010/wordprocessingDrawing" xmlns:wp="http://schemas.openxmlformats.org/drawingml/2006/wordprocessingDrawing" xmlns:w10="urn:schemas-microsoft-com:office:word" xmlns:w="http://schemas.openxmlformats.org/wordprocessingml/2006/main" xmlns:w14="http://schemas.microsoft.com/office/word/2010/wordml" xmlns:w15="http://schemas.microsoft.com/office/word/2012/wordml" xmlns:w16cex="http://schemas.microsoft.com/office/word/2018/wordml/cex" xmlns:w16cid="http://schemas.microsoft.com/office/word/2016/wordml/cid" xmlns:w16="http://schemas.microsoft.com/office/word/2018/wordml" xmlns:w16du="http://schemas.microsoft.com/office/word/2023/wordml/word16du" xmlns:w16sdtdh="http://schemas.microsoft.com/office/word/2020/wordml/sdtdatahash" xmlns:w16sdtfl="http://schemas.microsoft.com/office/word/2024/wordml/sdtformatlock" xmlns:w16se="http://schemas.microsoft.com/office/word/2015/wordml/symex" xmlns:wpg="http://schemas.microsoft.com/office/word/2010/wordprocessingGroup" xmlns:wpi="http://schemas.microsoft.com/office/word/2010/wordprocessingInk" xmlns:wne="http://schemas.microsoft.com/office/word/2006/wordml" xmlns:wps="http://schemas.microsoft.com/office/word/2010/wordprocessingShape" mc:Ignorable="w14 w15 w16se w16cid w16 w16cex w16sdtdh w16sdtfl w16du wp14">
   <w:tbl>
     <w:tblPr>
       <w:tblStyle w:val="BCBlockTable"/>
@@ -1116,6 +1123,7 @@
           <w:id w:val="-1878226836"/>
           <w:showingPlcHdr/>
           <w:picture/>
+          <w:dataBinding w:prefixMappings="xmlns:ns0='urn:microsoft-dynamics-nav/reports/Tenant_Report_Defaults/2000000001/' " w:xpath="/ns0:NavWordReportXmlPart[1]/ns0:BCReportInformation[1]/ns0:CompanyMetadata[1]/ns0:CompanyLogo[1]"/>
         </w:sdtPr>
         <w:sdtContent>
           <w:tc>
@@ -1212,6 +1220,7 @@
               </w:placeholder>
               <w15:color w:val="808080"/>
               <w:text/>
+              <w:dataBinding w:prefixMappings="xmlns:ns0='urn:microsoft-dynamics-nav/reports/Tenant_Report_Defaults/2000000001/' " w:xpath="/ns0:NavWordReportXmlPart[1]/ns0:BCReportInformation[1]/ns0:ReportMetadata[1]/ns0:ReportCaption[1]"/>
             </w:sdtPr>
             <w:sdtContent>
               <w:r>

</xml_diff>